<commit_message>
Update footer icons and remove unused files for improved asset management
</commit_message>
<xml_diff>
--- a/Sytogen_Detailed_Beginner_Guide.docx
+++ b/Sytogen_Detailed_Beginner_Guide.docx
@@ -82,13 +82,30 @@
     <w:p>
       <w:r>
         <w:tab/>
-        <w:t xml:space="preserve">Git is the storage hub that always a team to create software together and release it for public use. You can access a particular storage repository either through the GUI or through the command line in PowerShell. In order to make certain this developmental program works </w:t>
-      </w:r>
-      <w:proofErr w:type="gramStart"/>
-      <w:r>
-        <w:t>well,</w:t>
-      </w:r>
-      <w:proofErr w:type="gramEnd"/>
+      </w:r>
+      <w:r>
+        <w:t xml:space="preserve">Git is a version control system that allows teams to develop software collaboratively and distribute it through online repositories such as GitHub. While Git provides a graphical interface, this guide uses command-line tools because they are the most reliable way to set up and run </w:t>
+      </w:r>
+      <w:proofErr w:type="spellStart"/>
+      <w:r>
+        <w:t>Sytogen</w:t>
+      </w:r>
+      <w:proofErr w:type="spellEnd"/>
+      <w:r>
+        <w:t>. Commands that must be typed exactly as shown are displayed in a monospace font</w:t>
+      </w:r>
+      <w:r>
+        <w:t xml:space="preserve">. You can access a particular storage repository either through the GUI or through the command line in </w:t>
+      </w:r>
+      <w:r>
+        <w:t>Command Prompt</w:t>
+      </w:r>
+      <w:r>
+        <w:t xml:space="preserve">. In order to make certain this developmental program works </w:t>
+      </w:r>
+      <w:r>
+        <w:t>well;</w:t>
+      </w:r>
       <w:r>
         <w:t xml:space="preserve"> you’ll need to use the command line. Text that needs to be typed into the command line exactly as written will appear on a new line and in </w:t>
       </w:r>
@@ -157,7 +174,13 @@
         <w:pStyle w:val="ListNumber"/>
       </w:pPr>
       <w:r>
-        <w:t xml:space="preserve">Open PowerShell </w:t>
+        <w:t xml:space="preserve">Open </w:t>
+      </w:r>
+      <w:r>
+        <w:t>Command Prompt</w:t>
+      </w:r>
+      <w:r>
+        <w:t xml:space="preserve"> </w:t>
       </w:r>
       <w:r>
         <w:t>to check that you have a functioning version of Git. T</w:t>
@@ -295,7 +318,6 @@
           <w:sz w:val="20"/>
           <w:szCs w:val="20"/>
         </w:rPr>
-        <w:lastRenderedPageBreak/>
         <w:t>python --version</w:t>
       </w:r>
     </w:p>
@@ -312,12 +334,18 @@
         <w:pStyle w:val="Heading1"/>
       </w:pPr>
       <w:r>
-        <w:t>3. Open PowerShell</w:t>
+        <w:t xml:space="preserve">3. Open </w:t>
+      </w:r>
+      <w:r>
+        <w:t>Command Prompt</w:t>
       </w:r>
     </w:p>
     <w:p>
       <w:r>
-        <w:t>Power shell is the command line interface.</w:t>
+        <w:t>Command Prompt is the</w:t>
+      </w:r>
+      <w:r>
+        <w:t xml:space="preserve"> command line interface.</w:t>
       </w:r>
     </w:p>
     <w:p>
@@ -357,7 +385,7 @@
           <w:sz w:val="20"/>
           <w:szCs w:val="20"/>
         </w:rPr>
-        <w:t>PowerShell</w:t>
+        <w:t>Command Prompt</w:t>
       </w:r>
     </w:p>
     <w:p>
@@ -365,23 +393,23 @@
         <w:pStyle w:val="ListNumber"/>
       </w:pPr>
       <w:r>
-        <w:t>Select Windows PowerShell or Windows Terminal.</w:t>
+        <w:t>Open Command Prompt</w:t>
       </w:r>
     </w:p>
     <w:p>
       <w:pPr>
-        <w:pStyle w:val="ListNumber"/>
-      </w:pPr>
-      <w:r>
-        <w:t>All remaining commands in this document will be entered into this window.</w:t>
+        <w:pStyle w:val="Heading1"/>
+      </w:pPr>
+      <w:r>
+        <w:t>4. Create a Working Folder</w:t>
       </w:r>
     </w:p>
     <w:p>
       <w:pPr>
-        <w:pStyle w:val="Heading1"/>
-      </w:pPr>
-      <w:r>
-        <w:t>4. Create a Working Folder</w:t>
+        <w:pStyle w:val="ListNumber"/>
+      </w:pPr>
+      <w:r>
+        <w:t>Open Command Prompt</w:t>
       </w:r>
     </w:p>
     <w:p>
@@ -389,13 +417,15 @@
         <w:pStyle w:val="ListNumber"/>
       </w:pPr>
       <w:r>
-        <w:t>Type</w:t>
-      </w:r>
-      <w:r>
-        <w:t xml:space="preserve"> to create a new folder in your computer</w:t>
-      </w:r>
-      <w:r>
-        <w:t xml:space="preserve">: </w:t>
+        <w:t xml:space="preserve">To create a folder for </w:t>
+      </w:r>
+      <w:proofErr w:type="spellStart"/>
+      <w:r>
+        <w:t>Sytogen</w:t>
+      </w:r>
+      <w:proofErr w:type="spellEnd"/>
+      <w:r>
+        <w:t>, type:</w:t>
       </w:r>
     </w:p>
     <w:p>
@@ -656,6 +686,7 @@
         <w:pStyle w:val="ListNumber"/>
       </w:pPr>
       <w:r>
+        <w:lastRenderedPageBreak/>
         <w:t>Type</w:t>
       </w:r>
       <w:r>
@@ -703,7 +734,7 @@
           <w:sz w:val="20"/>
           <w:szCs w:val="20"/>
         </w:rPr>
-        <w:t xml:space="preserve"> .</w:t>
+        <w:t xml:space="preserve"> </w:t>
       </w:r>
       <w:proofErr w:type="spellStart"/>
       <w:r>
@@ -712,7 +743,15 @@
           <w:sz w:val="20"/>
           <w:szCs w:val="20"/>
         </w:rPr>
-        <w:t>venv</w:t>
+        <w:t>sytogen</w:t>
+      </w:r>
+      <w:r>
+        <w:rPr>
+          <w:rFonts w:ascii="Consolas" w:hAnsi="Consolas" w:cs="Consolas"/>
+          <w:sz w:val="20"/>
+          <w:szCs w:val="20"/>
+        </w:rPr>
+        <w:t>.venv</w:t>
       </w:r>
       <w:proofErr w:type="spellEnd"/>
     </w:p>
@@ -721,7 +760,6 @@
         <w:pStyle w:val="ListNumber"/>
       </w:pPr>
       <w:r>
-        <w:lastRenderedPageBreak/>
         <w:t>Press Enter.</w:t>
       </w:r>
     </w:p>
@@ -738,7 +776,18 @@
         <w:pStyle w:val="ListNumber"/>
       </w:pPr>
       <w:r>
-        <w:t>The .venv folder will be created automatically inside the Sytogen directory.</w:t>
+        <w:t xml:space="preserve">The </w:t>
+      </w:r>
+      <w:proofErr w:type="spellStart"/>
+      <w:r>
+        <w:t>sytogen</w:t>
+      </w:r>
+      <w:r>
+        <w:t>.venv</w:t>
+      </w:r>
+      <w:proofErr w:type="spellEnd"/>
+      <w:r>
+        <w:t xml:space="preserve"> folder will be created automatically inside the Sytogen directory.</w:t>
       </w:r>
     </w:p>
     <w:p>
@@ -771,22 +820,22 @@
           <w:szCs w:val="20"/>
         </w:rPr>
       </w:pPr>
+      <w:proofErr w:type="spellStart"/>
       <w:r>
         <w:rPr>
           <w:rFonts w:ascii="Consolas" w:hAnsi="Consolas" w:cs="Consolas"/>
           <w:sz w:val="20"/>
           <w:szCs w:val="20"/>
         </w:rPr>
-        <w:t>.\.</w:t>
-      </w:r>
-      <w:proofErr w:type="spellStart"/>
+        <w:t>sytogen</w:t>
+      </w:r>
       <w:r>
         <w:rPr>
           <w:rFonts w:ascii="Consolas" w:hAnsi="Consolas" w:cs="Consolas"/>
           <w:sz w:val="20"/>
           <w:szCs w:val="20"/>
         </w:rPr>
-        <w:t>venv</w:t>
+        <w:t>.venv</w:t>
       </w:r>
       <w:proofErr w:type="spellEnd"/>
       <w:r>
@@ -795,7 +844,7 @@
           <w:sz w:val="20"/>
           <w:szCs w:val="20"/>
         </w:rPr>
-        <w:t>\Scripts\Activate.ps1</w:t>
+        <w:t>\Scripts\activate</w:t>
       </w:r>
     </w:p>
     <w:p>
@@ -811,7 +860,18 @@
         <w:pStyle w:val="ListNumber"/>
       </w:pPr>
       <w:r>
-        <w:t>If successful, the beginning of the command prompt will display (.venv).</w:t>
+        <w:t>If successful, the beginning of the command prompt will display (</w:t>
+      </w:r>
+      <w:proofErr w:type="spellStart"/>
+      <w:r>
+        <w:t>sytogen</w:t>
+      </w:r>
+      <w:r>
+        <w:t>.venv</w:t>
+      </w:r>
+      <w:proofErr w:type="spellEnd"/>
+      <w:r>
+        <w:t>).</w:t>
       </w:r>
     </w:p>
     <w:p>
@@ -824,7 +884,18 @@
         <w:ind w:left="360"/>
       </w:pPr>
       <w:r>
-        <w:t>Example: (.venv) PS C:\Projects\Sytogen&gt;</w:t>
+        <w:t>Example: (</w:t>
+      </w:r>
+      <w:proofErr w:type="spellStart"/>
+      <w:r>
+        <w:t>sytogen</w:t>
+      </w:r>
+      <w:r>
+        <w:t>.venv</w:t>
+      </w:r>
+      <w:proofErr w:type="spellEnd"/>
+      <w:r>
+        <w:t>) PS C:\Projects\Sytogen&gt;</w:t>
       </w:r>
     </w:p>
     <w:p>
@@ -840,10 +911,7 @@
         <w:pStyle w:val="ListNumber"/>
       </w:pPr>
       <w:r>
-        <w:t>To update the python package installer type</w:t>
-      </w:r>
-      <w:r>
-        <w:t>:</w:t>
+        <w:t>To update the python package installer type:</w:t>
       </w:r>
     </w:p>
     <w:p>
@@ -927,7 +995,13 @@
         <w:pStyle w:val="ListNumber"/>
       </w:pPr>
       <w:r>
-        <w:t>Do not close the PowerShell window during installation.</w:t>
+        <w:t xml:space="preserve">Do not close the </w:t>
+      </w:r>
+      <w:r>
+        <w:t>Command Prompt</w:t>
+      </w:r>
+      <w:r>
+        <w:t xml:space="preserve"> window during installation.</w:t>
       </w:r>
     </w:p>
     <w:p>
@@ -943,7 +1017,7 @@
         <w:pStyle w:val="ListNumber"/>
       </w:pPr>
       <w:r>
-        <w:t>Verify that the PowerShell prompt still begins with (.venv).</w:t>
+        <w:t>Verify that the prompt still begins with (.venv).</w:t>
       </w:r>
     </w:p>
     <w:p>
@@ -974,7 +1048,23 @@
           <w:sz w:val="20"/>
           <w:szCs w:val="20"/>
         </w:rPr>
-        <w:t>python app.py</w:t>
+        <w:t xml:space="preserve">python </w:t>
+      </w:r>
+      <w:r>
+        <w:rPr>
+          <w:rFonts w:ascii="Consolas" w:hAnsi="Consolas" w:cs="Consolas"/>
+          <w:sz w:val="20"/>
+          <w:szCs w:val="20"/>
+        </w:rPr>
+        <w:t>run</w:t>
+      </w:r>
+      <w:r>
+        <w:rPr>
+          <w:rFonts w:ascii="Consolas" w:hAnsi="Consolas" w:cs="Consolas"/>
+          <w:sz w:val="20"/>
+          <w:szCs w:val="20"/>
+        </w:rPr>
+        <w:t>.py</w:t>
       </w:r>
     </w:p>
     <w:p>
@@ -1006,7 +1096,10 @@
         <w:pStyle w:val="ListNumber"/>
       </w:pPr>
       <w:r>
-        <w:t>Read the information displayed in PowerShell.</w:t>
+        <w:t xml:space="preserve">Read the information displayed in </w:t>
+      </w:r>
+      <w:r>
+        <w:t>Command Prompt</w:t>
       </w:r>
     </w:p>
     <w:p>
@@ -1014,31 +1107,58 @@
         <w:pStyle w:val="ListNumber"/>
       </w:pPr>
       <w:r>
-        <w:t>Locate the website address displayed by the application.</w:t>
+        <w:t>Look for a message similar to:</w:t>
       </w:r>
     </w:p>
     <w:p>
       <w:pPr>
         <w:pStyle w:val="ListNumber"/>
-      </w:pPr>
-      <w:r>
-        <w:t>Common local addresses may resemble http://127.0.0.1 or http://localhost.</w:t>
+        <w:numPr>
+          <w:ilvl w:val="0"/>
+          <w:numId w:val="0"/>
+        </w:numPr>
+        <w:ind w:left="360"/>
+        <w:rPr>
+          <w:rFonts w:ascii="Consolas" w:hAnsi="Consolas" w:cs="Consolas"/>
+        </w:rPr>
+      </w:pPr>
+      <w:r>
+        <w:rPr>
+          <w:rFonts w:ascii="Consolas" w:hAnsi="Consolas" w:cs="Consolas"/>
+        </w:rPr>
+        <w:t>http://127.0.0.1:5000</w:t>
       </w:r>
     </w:p>
     <w:p>
       <w:pPr>
         <w:pStyle w:val="ListNumber"/>
-      </w:pPr>
-      <w:r>
-        <w:t>Open a web browser and browse to the displayed address.</w:t>
+        <w:numPr>
+          <w:ilvl w:val="0"/>
+          <w:numId w:val="0"/>
+        </w:numPr>
+        <w:ind w:left="360"/>
+      </w:pPr>
+      <w:r>
+        <w:t>or</w:t>
       </w:r>
     </w:p>
     <w:p>
       <w:pPr>
-        <w:pStyle w:val="Heading1"/>
-      </w:pPr>
-      <w:r>
-        <w:t>11. Closing the Application</w:t>
+        <w:pStyle w:val="ListNumber"/>
+        <w:numPr>
+          <w:ilvl w:val="0"/>
+          <w:numId w:val="0"/>
+        </w:numPr>
+        <w:ind w:left="360"/>
+        <w:rPr>
+          <w:rFonts w:ascii="Consolas" w:hAnsi="Consolas" w:cs="Consolas"/>
+        </w:rPr>
+      </w:pPr>
+      <w:r>
+        <w:rPr>
+          <w:rFonts w:ascii="Consolas" w:hAnsi="Consolas" w:cs="Consolas"/>
+        </w:rPr>
+        <w:t>http://localhost:5000</w:t>
       </w:r>
     </w:p>
     <w:p>
@@ -1046,15 +1166,22 @@
         <w:pStyle w:val="ListNumber"/>
       </w:pPr>
       <w:r>
-        <w:t>Return to the PowerShell window.</w:t>
+        <w:t>Copy the address into a web browser if it does not open automatically.</w:t>
       </w:r>
     </w:p>
     <w:p>
       <w:pPr>
-        <w:pStyle w:val="ListNumber"/>
-      </w:pPr>
-      <w:r>
-        <w:t>Press Ctrl + C to stop the application.</w:t>
+        <w:pStyle w:val="Heading1"/>
+      </w:pPr>
+      <w:r>
+        <w:lastRenderedPageBreak/>
+        <w:t>1</w:t>
+      </w:r>
+      <w:r>
+        <w:t>1</w:t>
+      </w:r>
+      <w:r>
+        <w:t>. Updating Sytogen in the Future</w:t>
       </w:r>
     </w:p>
     <w:p>
@@ -1062,24 +1189,10 @@
         <w:pStyle w:val="ListNumber"/>
       </w:pPr>
       <w:r>
-        <w:t>The website will stop running after the process ends.</w:t>
-      </w:r>
-    </w:p>
-    <w:p>
-      <w:pPr>
-        <w:pStyle w:val="Heading1"/>
-      </w:pPr>
-      <w:r>
-        <w:lastRenderedPageBreak/>
-        <w:t>12. Updating Sytogen in the Future</w:t>
-      </w:r>
-    </w:p>
-    <w:p>
-      <w:pPr>
-        <w:pStyle w:val="ListNumber"/>
-      </w:pPr>
-      <w:r>
-        <w:t>Open PowerShell.</w:t>
+        <w:t xml:space="preserve">Open </w:t>
+      </w:r>
+      <w:r>
+        <w:t>Command Prompt</w:t>
       </w:r>
     </w:p>
     <w:p>
@@ -1118,8 +1231,95 @@
         <w:pStyle w:val="ListNumber"/>
       </w:pPr>
       <w:r>
-        <w:t xml:space="preserve">Type and </w:t>
-      </w:r>
+        <w:t>Verify that you are in the correct folder:</w:t>
+      </w:r>
+    </w:p>
+    <w:p>
+      <w:pPr>
+        <w:pStyle w:val="ListNumber"/>
+        <w:numPr>
+          <w:ilvl w:val="0"/>
+          <w:numId w:val="0"/>
+        </w:numPr>
+        <w:ind w:left="720"/>
+        <w:rPr>
+          <w:rFonts w:ascii="Consolas" w:hAnsi="Consolas" w:cs="Consolas"/>
+          <w:sz w:val="20"/>
+          <w:szCs w:val="20"/>
+        </w:rPr>
+      </w:pPr>
+      <w:proofErr w:type="spellStart"/>
+      <w:r>
+        <w:rPr>
+          <w:rFonts w:ascii="Consolas" w:hAnsi="Consolas" w:cs="Consolas"/>
+          <w:sz w:val="20"/>
+          <w:szCs w:val="20"/>
+        </w:rPr>
+        <w:t>dir</w:t>
+      </w:r>
+      <w:proofErr w:type="spellEnd"/>
+    </w:p>
+    <w:p>
+      <w:pPr>
+        <w:pStyle w:val="ListNumber"/>
+        <w:numPr>
+          <w:ilvl w:val="0"/>
+          <w:numId w:val="0"/>
+        </w:numPr>
+        <w:ind w:left="360"/>
+      </w:pPr>
+      <w:r>
+        <w:t>you should see requirements.txt and run.py in this folder.</w:t>
+      </w:r>
+    </w:p>
+    <w:p>
+      <w:pPr>
+        <w:pStyle w:val="ListNumber"/>
+      </w:pPr>
+      <w:r>
+        <w:t xml:space="preserve">Activate the virtual environment: </w:t>
+      </w:r>
+    </w:p>
+    <w:p>
+      <w:pPr>
+        <w:pStyle w:val="ListNumber"/>
+        <w:numPr>
+          <w:ilvl w:val="0"/>
+          <w:numId w:val="0"/>
+        </w:numPr>
+        <w:ind w:left="360" w:firstLine="360"/>
+      </w:pPr>
+      <w:r>
+        <w:rPr>
+          <w:rFonts w:ascii="Consolas" w:hAnsi="Consolas" w:cs="Consolas"/>
+          <w:sz w:val="20"/>
+          <w:szCs w:val="20"/>
+        </w:rPr>
+        <w:t>.\</w:t>
+      </w:r>
+      <w:proofErr w:type="spellStart"/>
+      <w:r>
+        <w:rPr>
+          <w:rFonts w:ascii="Consolas" w:hAnsi="Consolas" w:cs="Consolas"/>
+          <w:sz w:val="20"/>
+          <w:szCs w:val="20"/>
+        </w:rPr>
+        <w:t>sytogen.venv</w:t>
+      </w:r>
+      <w:proofErr w:type="spellEnd"/>
+      <w:r>
+        <w:rPr>
+          <w:rFonts w:ascii="Consolas" w:hAnsi="Consolas" w:cs="Consolas"/>
+          <w:sz w:val="20"/>
+          <w:szCs w:val="20"/>
+        </w:rPr>
+        <w:t>\Scripts\activate.bat</w:t>
+      </w:r>
+    </w:p>
+    <w:p>
+      <w:pPr>
+        <w:pStyle w:val="ListNumber"/>
+      </w:pPr>
       <w:r>
         <w:t xml:space="preserve">Run: </w:t>
       </w:r>
@@ -1144,64 +1344,16 @@
           <w:sz w:val="20"/>
           <w:szCs w:val="20"/>
         </w:rPr>
-        <w:t>git pull</w:t>
-      </w:r>
-    </w:p>
-    <w:p>
-      <w:pPr>
-        <w:pStyle w:val="ListNumber"/>
-      </w:pPr>
-      <w:r>
-        <w:t xml:space="preserve">Activate the virtual environment: </w:t>
-      </w:r>
-    </w:p>
-    <w:p>
-      <w:pPr>
-        <w:pStyle w:val="ListNumber"/>
-        <w:numPr>
-          <w:ilvl w:val="0"/>
-          <w:numId w:val="0"/>
-        </w:numPr>
-        <w:ind w:firstLine="720"/>
+        <w:t xml:space="preserve">git </w:t>
+      </w:r>
+      <w:proofErr w:type="spellStart"/>
+      <w:r>
         <w:rPr>
           <w:rFonts w:ascii="Consolas" w:hAnsi="Consolas" w:cs="Consolas"/>
           <w:sz w:val="20"/>
           <w:szCs w:val="20"/>
         </w:rPr>
-      </w:pPr>
-      <w:r>
-        <w:rPr>
-          <w:rFonts w:ascii="Consolas" w:hAnsi="Consolas" w:cs="Consolas"/>
-          <w:sz w:val="20"/>
-          <w:szCs w:val="20"/>
-        </w:rPr>
-        <w:t>.\.</w:t>
-      </w:r>
-      <w:proofErr w:type="spellStart"/>
-      <w:r>
-        <w:rPr>
-          <w:rFonts w:ascii="Consolas" w:hAnsi="Consolas" w:cs="Consolas"/>
-          <w:sz w:val="20"/>
-          <w:szCs w:val="20"/>
-        </w:rPr>
-        <w:t>venv</w:t>
-      </w:r>
-      <w:proofErr w:type="spellEnd"/>
-      <w:r>
-        <w:rPr>
-          <w:rFonts w:ascii="Consolas" w:hAnsi="Consolas" w:cs="Consolas"/>
-          <w:sz w:val="20"/>
-          <w:szCs w:val="20"/>
-        </w:rPr>
-        <w:t>\Scripts\Activate.ps1</w:t>
-      </w:r>
-    </w:p>
-    <w:p>
-      <w:pPr>
-        <w:pStyle w:val="ListNumber"/>
-      </w:pPr>
-      <w:r>
-        <w:t xml:space="preserve">Run: </w:t>
+        <w:t>pull</w:t>
       </w:r>
     </w:p>
     <w:p>
@@ -1218,6 +1370,7 @@
           <w:szCs w:val="20"/>
         </w:rPr>
       </w:pPr>
+      <w:proofErr w:type="spellEnd"/>
       <w:r>
         <w:rPr>
           <w:rFonts w:ascii="Consolas" w:hAnsi="Consolas" w:cs="Consolas"/>
@@ -1255,7 +1408,23 @@
           <w:sz w:val="20"/>
           <w:szCs w:val="20"/>
         </w:rPr>
-        <w:t>python app.py</w:t>
+        <w:t xml:space="preserve">python </w:t>
+      </w:r>
+      <w:r>
+        <w:rPr>
+          <w:rFonts w:ascii="Consolas" w:hAnsi="Consolas" w:cs="Consolas"/>
+          <w:sz w:val="20"/>
+          <w:szCs w:val="20"/>
+        </w:rPr>
+        <w:t>run</w:t>
+      </w:r>
+      <w:r>
+        <w:rPr>
+          <w:rFonts w:ascii="Consolas" w:hAnsi="Consolas" w:cs="Consolas"/>
+          <w:sz w:val="20"/>
+          <w:szCs w:val="20"/>
+        </w:rPr>
+        <w:t>.py</w:t>
       </w:r>
     </w:p>
     <w:p>
@@ -1271,15 +1440,20 @@
         <w:pStyle w:val="ListBullet"/>
       </w:pPr>
       <w:r>
-        <w:t>Git is not recognized: Close PowerShell and reopen it. If the problem persists, reinstall Git.</w:t>
+        <w:t xml:space="preserve">Git is not recognized: </w:t>
       </w:r>
     </w:p>
     <w:p>
       <w:pPr>
         <w:pStyle w:val="ListBullet"/>
-      </w:pPr>
-      <w:r>
-        <w:t>Python is not recognized: Reinstall Python and ensure Add Python to PATH is selected during installation.</w:t>
+        <w:numPr>
+          <w:ilvl w:val="0"/>
+          <w:numId w:val="0"/>
+        </w:numPr>
+        <w:ind w:left="720"/>
+      </w:pPr>
+      <w:r>
+        <w:t>Close PowerShell and reopen it. If the problem persists, reinstall Git.</w:t>
       </w:r>
     </w:p>
     <w:p>
@@ -1287,15 +1461,20 @@
         <w:pStyle w:val="ListBullet"/>
       </w:pPr>
       <w:r>
-        <w:t>Activation script blocked: Run PowerShell as Administrator and execute Set-ExecutionPolicy -Scope CurrentUser RemoteSigned.</w:t>
+        <w:t xml:space="preserve">Python is not recognized: </w:t>
       </w:r>
     </w:p>
     <w:p>
       <w:pPr>
         <w:pStyle w:val="ListBullet"/>
-      </w:pPr>
-      <w:r>
-        <w:t>Package installation errors: Confirm internet access and carefully review the error displayed in PowerShell.</w:t>
+        <w:numPr>
+          <w:ilvl w:val="0"/>
+          <w:numId w:val="0"/>
+        </w:numPr>
+        <w:ind w:left="720"/>
+      </w:pPr>
+      <w:r>
+        <w:t>Reinstall Python and ensure Add Python to PATH is selected during installation.</w:t>
       </w:r>
     </w:p>
     <w:p>
@@ -1303,7 +1482,56 @@
         <w:pStyle w:val="ListBullet"/>
       </w:pPr>
       <w:r>
-        <w:t>Website does not load: Verify that python app.py is still running and review any error messages in the PowerShell window.</w:t>
+        <w:t xml:space="preserve">Package installation errors: </w:t>
+      </w:r>
+    </w:p>
+    <w:p>
+      <w:pPr>
+        <w:pStyle w:val="ListBullet"/>
+        <w:numPr>
+          <w:ilvl w:val="0"/>
+          <w:numId w:val="0"/>
+        </w:numPr>
+        <w:ind w:left="360" w:firstLine="360"/>
+      </w:pPr>
+      <w:r>
+        <w:t>Confirm internet access and carefully review the error display</w:t>
+      </w:r>
+      <w:r>
+        <w:t>ed</w:t>
+      </w:r>
+    </w:p>
+    <w:p>
+      <w:pPr>
+        <w:pStyle w:val="ListBullet"/>
+      </w:pPr>
+      <w:r>
+        <w:t xml:space="preserve">Website does not load: </w:t>
+      </w:r>
+    </w:p>
+    <w:p>
+      <w:pPr>
+        <w:pStyle w:val="ListBullet"/>
+        <w:numPr>
+          <w:ilvl w:val="0"/>
+          <w:numId w:val="0"/>
+        </w:numPr>
+        <w:ind w:left="720"/>
+      </w:pPr>
+      <w:r>
+        <w:t xml:space="preserve">Verify that python </w:t>
+      </w:r>
+      <w:r>
+        <w:t>run</w:t>
+      </w:r>
+      <w:r>
+        <w:t xml:space="preserve">.py is still running and review any error messages in the </w:t>
+      </w:r>
+      <w:r>
+        <w:t>Command Prompt</w:t>
+      </w:r>
+      <w:r>
+        <w:t xml:space="preserve"> window.</w:t>
       </w:r>
     </w:p>
     <w:sectPr>
@@ -2122,7 +2350,6 @@
   <w:style w:type="character" w:default="1" w:styleId="DefaultParagraphFont">
     <w:name w:val="Default Paragraph Font"/>
     <w:uiPriority w:val="1"/>
-    <w:semiHidden/>
     <w:unhideWhenUsed/>
   </w:style>
   <w:style w:type="table" w:default="1" w:styleId="TableNormal">

</xml_diff>